<commit_message>
feat: complete questions and quizzes import, database synchronization, direct publishing, and template parser fixes
</commit_message>
<xml_diff>
--- a/public/templates/question_template.docx
+++ b/public/templates/question_template.docx
@@ -92,7 +92,7 @@
                 <w:color w:val="115E59"/>
                 <w:sz w:val="20"/>
               </w:rPr>
-              <w:t>2. Keep the metadata identifiers intact: 'Question X:', 'Options:', 'Correct Answer:', 'High-Yield Rationale:', 'Difficulty:', 'Topic:', 'Subtopic:', and 'Tags:'.</w:t>
+              <w:t>2. Keep the metadata identifiers intact: 'Question X:', 'Options:', 'Correct Answer:', 'Explanation:', 'Difficulty:', 'Topic:', 'Subtopic:', and 'Tags:'.</w:t>
             </w:r>
           </w:p>
           <w:p>
@@ -282,7 +282,7 @@
           <w:color w:val="0F766E"/>
           <w:sz w:val="22"/>
         </w:rPr>
-        <w:t>High-Yield Rationale:</w:t>
+        <w:t>Explanation:</w:t>
       </w:r>
     </w:p>
     <w:p>
@@ -546,7 +546,7 @@
           <w:color w:val="0F766E"/>
           <w:sz w:val="22"/>
         </w:rPr>
-        <w:t>High-Yield Rationale:</w:t>
+        <w:t>Explanation:</w:t>
       </w:r>
     </w:p>
     <w:p>
@@ -779,7 +779,7 @@
           <w:color w:val="0F766E"/>
           <w:sz w:val="22"/>
         </w:rPr>
-        <w:t>High-Yield Rationale:</w:t>
+        <w:t>Explanation:</w:t>
       </w:r>
     </w:p>
     <w:p>
@@ -994,7 +994,7 @@
           <w:color w:val="0F766E"/>
           <w:sz w:val="22"/>
         </w:rPr>
-        <w:t>High-Yield Rationale:</w:t>
+        <w:t>Explanation:</w:t>
       </w:r>
     </w:p>
     <w:p>
@@ -1209,7 +1209,7 @@
           <w:color w:val="0F766E"/>
           <w:sz w:val="22"/>
         </w:rPr>
-        <w:t>High-Yield Rationale:</w:t>
+        <w:t>Explanation:</w:t>
       </w:r>
     </w:p>
     <w:p>
@@ -1424,7 +1424,7 @@
           <w:color w:val="0F766E"/>
           <w:sz w:val="22"/>
         </w:rPr>
-        <w:t>High-Yield Rationale:</w:t>
+        <w:t>Explanation:</w:t>
       </w:r>
     </w:p>
     <w:p>
@@ -1639,7 +1639,7 @@
           <w:color w:val="0F766E"/>
           <w:sz w:val="22"/>
         </w:rPr>
-        <w:t>High-Yield Rationale:</w:t>
+        <w:t>Explanation:</w:t>
       </w:r>
     </w:p>
     <w:p>
@@ -1854,7 +1854,7 @@
           <w:color w:val="0F766E"/>
           <w:sz w:val="22"/>
         </w:rPr>
-        <w:t>High-Yield Rationale:</w:t>
+        <w:t>Explanation:</w:t>
       </w:r>
     </w:p>
     <w:p>
@@ -2069,7 +2069,7 @@
           <w:color w:val="0F766E"/>
           <w:sz w:val="22"/>
         </w:rPr>
-        <w:t>High-Yield Rationale:</w:t>
+        <w:t>Explanation:</w:t>
       </w:r>
     </w:p>
     <w:p>
@@ -2284,7 +2284,7 @@
           <w:color w:val="0F766E"/>
           <w:sz w:val="22"/>
         </w:rPr>
-        <w:t>High-Yield Rationale:</w:t>
+        <w:t>Explanation:</w:t>
       </w:r>
     </w:p>
     <w:p>
@@ -2499,7 +2499,7 @@
           <w:color w:val="0F766E"/>
           <w:sz w:val="22"/>
         </w:rPr>
-        <w:t>High-Yield Rationale:</w:t>
+        <w:t>Explanation:</w:t>
       </w:r>
     </w:p>
     <w:p>
@@ -2714,7 +2714,7 @@
           <w:color w:val="0F766E"/>
           <w:sz w:val="22"/>
         </w:rPr>
-        <w:t>High-Yield Rationale:</w:t>
+        <w:t>Explanation:</w:t>
       </w:r>
     </w:p>
     <w:p>
@@ -2929,7 +2929,7 @@
           <w:color w:val="0F766E"/>
           <w:sz w:val="22"/>
         </w:rPr>
-        <w:t>High-Yield Rationale:</w:t>
+        <w:t>Explanation:</w:t>
       </w:r>
     </w:p>
     <w:p>
@@ -3144,7 +3144,7 @@
           <w:color w:val="0F766E"/>
           <w:sz w:val="22"/>
         </w:rPr>
-        <w:t>High-Yield Rationale:</w:t>
+        <w:t>Explanation:</w:t>
       </w:r>
     </w:p>
     <w:p>
@@ -3359,7 +3359,7 @@
           <w:color w:val="0F766E"/>
           <w:sz w:val="22"/>
         </w:rPr>
-        <w:t>High-Yield Rationale:</w:t>
+        <w:t>Explanation:</w:t>
       </w:r>
     </w:p>
     <w:p>
@@ -3574,7 +3574,7 @@
           <w:color w:val="0F766E"/>
           <w:sz w:val="22"/>
         </w:rPr>
-        <w:t>High-Yield Rationale:</w:t>
+        <w:t>Explanation:</w:t>
       </w:r>
     </w:p>
     <w:p>
@@ -3789,7 +3789,7 @@
           <w:color w:val="0F766E"/>
           <w:sz w:val="22"/>
         </w:rPr>
-        <w:t>High-Yield Rationale:</w:t>
+        <w:t>Explanation:</w:t>
       </w:r>
     </w:p>
     <w:p>
@@ -4004,7 +4004,7 @@
           <w:color w:val="0F766E"/>
           <w:sz w:val="22"/>
         </w:rPr>
-        <w:t>High-Yield Rationale:</w:t>
+        <w:t>Explanation:</w:t>
       </w:r>
     </w:p>
     <w:p>
@@ -4219,7 +4219,7 @@
           <w:color w:val="0F766E"/>
           <w:sz w:val="22"/>
         </w:rPr>
-        <w:t>High-Yield Rationale:</w:t>
+        <w:t>Explanation:</w:t>
       </w:r>
     </w:p>
     <w:p>
@@ -4434,7 +4434,7 @@
           <w:color w:val="0F766E"/>
           <w:sz w:val="22"/>
         </w:rPr>
-        <w:t>High-Yield Rationale:</w:t>
+        <w:t>Explanation:</w:t>
       </w:r>
     </w:p>
     <w:p>
@@ -4649,7 +4649,7 @@
           <w:color w:val="0F766E"/>
           <w:sz w:val="22"/>
         </w:rPr>
-        <w:t>High-Yield Rationale:</w:t>
+        <w:t>Explanation:</w:t>
       </w:r>
     </w:p>
     <w:p>
@@ -4864,7 +4864,7 @@
           <w:color w:val="0F766E"/>
           <w:sz w:val="22"/>
         </w:rPr>
-        <w:t>High-Yield Rationale:</w:t>
+        <w:t>Explanation:</w:t>
       </w:r>
     </w:p>
     <w:p>
@@ -5079,7 +5079,7 @@
           <w:color w:val="0F766E"/>
           <w:sz w:val="22"/>
         </w:rPr>
-        <w:t>High-Yield Rationale:</w:t>
+        <w:t>Explanation:</w:t>
       </w:r>
     </w:p>
     <w:p>
@@ -5294,7 +5294,7 @@
           <w:color w:val="0F766E"/>
           <w:sz w:val="22"/>
         </w:rPr>
-        <w:t>High-Yield Rationale:</w:t>
+        <w:t>Explanation:</w:t>
       </w:r>
     </w:p>
     <w:p>
@@ -5509,7 +5509,7 @@
           <w:color w:val="0F766E"/>
           <w:sz w:val="22"/>
         </w:rPr>
-        <w:t>High-Yield Rationale:</w:t>
+        <w:t>Explanation:</w:t>
       </w:r>
     </w:p>
     <w:p>
@@ -5724,7 +5724,7 @@
           <w:color w:val="0F766E"/>
           <w:sz w:val="22"/>
         </w:rPr>
-        <w:t>High-Yield Rationale:</w:t>
+        <w:t>Explanation:</w:t>
       </w:r>
     </w:p>
     <w:p>
@@ -5939,7 +5939,7 @@
           <w:color w:val="0F766E"/>
           <w:sz w:val="22"/>
         </w:rPr>
-        <w:t>High-Yield Rationale:</w:t>
+        <w:t>Explanation:</w:t>
       </w:r>
     </w:p>
     <w:p>
@@ -6154,7 +6154,7 @@
           <w:color w:val="0F766E"/>
           <w:sz w:val="22"/>
         </w:rPr>
-        <w:t>High-Yield Rationale:</w:t>
+        <w:t>Explanation:</w:t>
       </w:r>
     </w:p>
     <w:p>
@@ -6369,7 +6369,7 @@
           <w:color w:val="0F766E"/>
           <w:sz w:val="22"/>
         </w:rPr>
-        <w:t>High-Yield Rationale:</w:t>
+        <w:t>Explanation:</w:t>
       </w:r>
     </w:p>
     <w:p>
@@ -6584,7 +6584,7 @@
           <w:color w:val="0F766E"/>
           <w:sz w:val="22"/>
         </w:rPr>
-        <w:t>High-Yield Rationale:</w:t>
+        <w:t>Explanation:</w:t>
       </w:r>
     </w:p>
     <w:p>
@@ -6799,7 +6799,7 @@
           <w:color w:val="0F766E"/>
           <w:sz w:val="22"/>
         </w:rPr>
-        <w:t>High-Yield Rationale:</w:t>
+        <w:t>Explanation:</w:t>
       </w:r>
     </w:p>
     <w:p>
@@ -7014,7 +7014,7 @@
           <w:color w:val="0F766E"/>
           <w:sz w:val="22"/>
         </w:rPr>
-        <w:t>High-Yield Rationale:</w:t>
+        <w:t>Explanation:</w:t>
       </w:r>
     </w:p>
     <w:p>
@@ -7229,7 +7229,7 @@
           <w:color w:val="0F766E"/>
           <w:sz w:val="22"/>
         </w:rPr>
-        <w:t>High-Yield Rationale:</w:t>
+        <w:t>Explanation:</w:t>
       </w:r>
     </w:p>
     <w:p>
@@ -7444,7 +7444,7 @@
           <w:color w:val="0F766E"/>
           <w:sz w:val="22"/>
         </w:rPr>
-        <w:t>High-Yield Rationale:</w:t>
+        <w:t>Explanation:</w:t>
       </w:r>
     </w:p>
     <w:p>
@@ -7659,7 +7659,7 @@
           <w:color w:val="0F766E"/>
           <w:sz w:val="22"/>
         </w:rPr>
-        <w:t>High-Yield Rationale:</w:t>
+        <w:t>Explanation:</w:t>
       </w:r>
     </w:p>
     <w:p>
@@ -7874,7 +7874,7 @@
           <w:color w:val="0F766E"/>
           <w:sz w:val="22"/>
         </w:rPr>
-        <w:t>High-Yield Rationale:</w:t>
+        <w:t>Explanation:</w:t>
       </w:r>
     </w:p>
     <w:p>
@@ -8089,7 +8089,7 @@
           <w:color w:val="0F766E"/>
           <w:sz w:val="22"/>
         </w:rPr>
-        <w:t>High-Yield Rationale:</w:t>
+        <w:t>Explanation:</w:t>
       </w:r>
     </w:p>
     <w:p>
@@ -8304,7 +8304,7 @@
           <w:color w:val="0F766E"/>
           <w:sz w:val="22"/>
         </w:rPr>
-        <w:t>High-Yield Rationale:</w:t>
+        <w:t>Explanation:</w:t>
       </w:r>
     </w:p>
     <w:p>
@@ -8519,7 +8519,7 @@
           <w:color w:val="0F766E"/>
           <w:sz w:val="22"/>
         </w:rPr>
-        <w:t>High-Yield Rationale:</w:t>
+        <w:t>Explanation:</w:t>
       </w:r>
     </w:p>
     <w:p>
@@ -8734,7 +8734,7 @@
           <w:color w:val="0F766E"/>
           <w:sz w:val="22"/>
         </w:rPr>
-        <w:t>High-Yield Rationale:</w:t>
+        <w:t>Explanation:</w:t>
       </w:r>
     </w:p>
     <w:p>
@@ -8949,7 +8949,7 @@
           <w:color w:val="0F766E"/>
           <w:sz w:val="22"/>
         </w:rPr>
-        <w:t>High-Yield Rationale:</w:t>
+        <w:t>Explanation:</w:t>
       </w:r>
     </w:p>
     <w:p>
@@ -9164,7 +9164,7 @@
           <w:color w:val="0F766E"/>
           <w:sz w:val="22"/>
         </w:rPr>
-        <w:t>High-Yield Rationale:</w:t>
+        <w:t>Explanation:</w:t>
       </w:r>
     </w:p>
     <w:p>
@@ -9379,7 +9379,7 @@
           <w:color w:val="0F766E"/>
           <w:sz w:val="22"/>
         </w:rPr>
-        <w:t>High-Yield Rationale:</w:t>
+        <w:t>Explanation:</w:t>
       </w:r>
     </w:p>
     <w:p>
@@ -9594,7 +9594,7 @@
           <w:color w:val="0F766E"/>
           <w:sz w:val="22"/>
         </w:rPr>
-        <w:t>High-Yield Rationale:</w:t>
+        <w:t>Explanation:</w:t>
       </w:r>
     </w:p>
     <w:p>
@@ -9809,7 +9809,7 @@
           <w:color w:val="0F766E"/>
           <w:sz w:val="22"/>
         </w:rPr>
-        <w:t>High-Yield Rationale:</w:t>
+        <w:t>Explanation:</w:t>
       </w:r>
     </w:p>
     <w:p>
@@ -10024,7 +10024,7 @@
           <w:color w:val="0F766E"/>
           <w:sz w:val="22"/>
         </w:rPr>
-        <w:t>High-Yield Rationale:</w:t>
+        <w:t>Explanation:</w:t>
       </w:r>
     </w:p>
     <w:p>
@@ -10239,7 +10239,7 @@
           <w:color w:val="0F766E"/>
           <w:sz w:val="22"/>
         </w:rPr>
-        <w:t>High-Yield Rationale:</w:t>
+        <w:t>Explanation:</w:t>
       </w:r>
     </w:p>
     <w:p>
@@ -10454,7 +10454,7 @@
           <w:color w:val="0F766E"/>
           <w:sz w:val="22"/>
         </w:rPr>
-        <w:t>High-Yield Rationale:</w:t>
+        <w:t>Explanation:</w:t>
       </w:r>
     </w:p>
     <w:p>
@@ -10669,7 +10669,7 @@
           <w:color w:val="0F766E"/>
           <w:sz w:val="22"/>
         </w:rPr>
-        <w:t>High-Yield Rationale:</w:t>
+        <w:t>Explanation:</w:t>
       </w:r>
     </w:p>
     <w:p>
@@ -10884,7 +10884,7 @@
           <w:color w:val="0F766E"/>
           <w:sz w:val="22"/>
         </w:rPr>
-        <w:t>High-Yield Rationale:</w:t>
+        <w:t>Explanation:</w:t>
       </w:r>
     </w:p>
     <w:p>

</xml_diff>

<commit_message>
release: project manager approved production update
</commit_message>
<xml_diff>
--- a/public/templates/question_template.docx
+++ b/public/templates/question_template.docx
@@ -92,7 +92,7 @@
                 <w:color w:val="115E59"/>
                 <w:sz w:val="20"/>
               </w:rPr>
-              <w:t>2. Keep the metadata identifiers intact: 'Question X:', 'Options:', 'Correct Answer:', 'High-Yield Rationale:', 'Difficulty:', 'Topic:', 'Subtopic:', and 'Tags:'.</w:t>
+              <w:t>2. Keep the metadata identifiers intact: 'Question X:', 'Options:', 'Correct Answer:', 'Explanation:', 'Difficulty:', 'Topic:', 'Subtopic:', and 'Tags:'.</w:t>
             </w:r>
           </w:p>
           <w:p>
@@ -282,7 +282,7 @@
           <w:color w:val="0F766E"/>
           <w:sz w:val="22"/>
         </w:rPr>
-        <w:t>High-Yield Rationale:</w:t>
+        <w:t>Explanation:</w:t>
       </w:r>
     </w:p>
     <w:p>
@@ -546,7 +546,7 @@
           <w:color w:val="0F766E"/>
           <w:sz w:val="22"/>
         </w:rPr>
-        <w:t>High-Yield Rationale:</w:t>
+        <w:t>Explanation:</w:t>
       </w:r>
     </w:p>
     <w:p>
@@ -779,7 +779,7 @@
           <w:color w:val="0F766E"/>
           <w:sz w:val="22"/>
         </w:rPr>
-        <w:t>High-Yield Rationale:</w:t>
+        <w:t>Explanation:</w:t>
       </w:r>
     </w:p>
     <w:p>
@@ -994,7 +994,7 @@
           <w:color w:val="0F766E"/>
           <w:sz w:val="22"/>
         </w:rPr>
-        <w:t>High-Yield Rationale:</w:t>
+        <w:t>Explanation:</w:t>
       </w:r>
     </w:p>
     <w:p>
@@ -1209,7 +1209,7 @@
           <w:color w:val="0F766E"/>
           <w:sz w:val="22"/>
         </w:rPr>
-        <w:t>High-Yield Rationale:</w:t>
+        <w:t>Explanation:</w:t>
       </w:r>
     </w:p>
     <w:p>
@@ -1424,7 +1424,7 @@
           <w:color w:val="0F766E"/>
           <w:sz w:val="22"/>
         </w:rPr>
-        <w:t>High-Yield Rationale:</w:t>
+        <w:t>Explanation:</w:t>
       </w:r>
     </w:p>
     <w:p>
@@ -1639,7 +1639,7 @@
           <w:color w:val="0F766E"/>
           <w:sz w:val="22"/>
         </w:rPr>
-        <w:t>High-Yield Rationale:</w:t>
+        <w:t>Explanation:</w:t>
       </w:r>
     </w:p>
     <w:p>
@@ -1854,7 +1854,7 @@
           <w:color w:val="0F766E"/>
           <w:sz w:val="22"/>
         </w:rPr>
-        <w:t>High-Yield Rationale:</w:t>
+        <w:t>Explanation:</w:t>
       </w:r>
     </w:p>
     <w:p>
@@ -2069,7 +2069,7 @@
           <w:color w:val="0F766E"/>
           <w:sz w:val="22"/>
         </w:rPr>
-        <w:t>High-Yield Rationale:</w:t>
+        <w:t>Explanation:</w:t>
       </w:r>
     </w:p>
     <w:p>
@@ -2284,7 +2284,7 @@
           <w:color w:val="0F766E"/>
           <w:sz w:val="22"/>
         </w:rPr>
-        <w:t>High-Yield Rationale:</w:t>
+        <w:t>Explanation:</w:t>
       </w:r>
     </w:p>
     <w:p>
@@ -2499,7 +2499,7 @@
           <w:color w:val="0F766E"/>
           <w:sz w:val="22"/>
         </w:rPr>
-        <w:t>High-Yield Rationale:</w:t>
+        <w:t>Explanation:</w:t>
       </w:r>
     </w:p>
     <w:p>
@@ -2714,7 +2714,7 @@
           <w:color w:val="0F766E"/>
           <w:sz w:val="22"/>
         </w:rPr>
-        <w:t>High-Yield Rationale:</w:t>
+        <w:t>Explanation:</w:t>
       </w:r>
     </w:p>
     <w:p>
@@ -2929,7 +2929,7 @@
           <w:color w:val="0F766E"/>
           <w:sz w:val="22"/>
         </w:rPr>
-        <w:t>High-Yield Rationale:</w:t>
+        <w:t>Explanation:</w:t>
       </w:r>
     </w:p>
     <w:p>
@@ -3144,7 +3144,7 @@
           <w:color w:val="0F766E"/>
           <w:sz w:val="22"/>
         </w:rPr>
-        <w:t>High-Yield Rationale:</w:t>
+        <w:t>Explanation:</w:t>
       </w:r>
     </w:p>
     <w:p>
@@ -3359,7 +3359,7 @@
           <w:color w:val="0F766E"/>
           <w:sz w:val="22"/>
         </w:rPr>
-        <w:t>High-Yield Rationale:</w:t>
+        <w:t>Explanation:</w:t>
       </w:r>
     </w:p>
     <w:p>
@@ -3574,7 +3574,7 @@
           <w:color w:val="0F766E"/>
           <w:sz w:val="22"/>
         </w:rPr>
-        <w:t>High-Yield Rationale:</w:t>
+        <w:t>Explanation:</w:t>
       </w:r>
     </w:p>
     <w:p>
@@ -3789,7 +3789,7 @@
           <w:color w:val="0F766E"/>
           <w:sz w:val="22"/>
         </w:rPr>
-        <w:t>High-Yield Rationale:</w:t>
+        <w:t>Explanation:</w:t>
       </w:r>
     </w:p>
     <w:p>
@@ -4004,7 +4004,7 @@
           <w:color w:val="0F766E"/>
           <w:sz w:val="22"/>
         </w:rPr>
-        <w:t>High-Yield Rationale:</w:t>
+        <w:t>Explanation:</w:t>
       </w:r>
     </w:p>
     <w:p>
@@ -4219,7 +4219,7 @@
           <w:color w:val="0F766E"/>
           <w:sz w:val="22"/>
         </w:rPr>
-        <w:t>High-Yield Rationale:</w:t>
+        <w:t>Explanation:</w:t>
       </w:r>
     </w:p>
     <w:p>
@@ -4434,7 +4434,7 @@
           <w:color w:val="0F766E"/>
           <w:sz w:val="22"/>
         </w:rPr>
-        <w:t>High-Yield Rationale:</w:t>
+        <w:t>Explanation:</w:t>
       </w:r>
     </w:p>
     <w:p>
@@ -4649,7 +4649,7 @@
           <w:color w:val="0F766E"/>
           <w:sz w:val="22"/>
         </w:rPr>
-        <w:t>High-Yield Rationale:</w:t>
+        <w:t>Explanation:</w:t>
       </w:r>
     </w:p>
     <w:p>
@@ -4864,7 +4864,7 @@
           <w:color w:val="0F766E"/>
           <w:sz w:val="22"/>
         </w:rPr>
-        <w:t>High-Yield Rationale:</w:t>
+        <w:t>Explanation:</w:t>
       </w:r>
     </w:p>
     <w:p>
@@ -5079,7 +5079,7 @@
           <w:color w:val="0F766E"/>
           <w:sz w:val="22"/>
         </w:rPr>
-        <w:t>High-Yield Rationale:</w:t>
+        <w:t>Explanation:</w:t>
       </w:r>
     </w:p>
     <w:p>
@@ -5294,7 +5294,7 @@
           <w:color w:val="0F766E"/>
           <w:sz w:val="22"/>
         </w:rPr>
-        <w:t>High-Yield Rationale:</w:t>
+        <w:t>Explanation:</w:t>
       </w:r>
     </w:p>
     <w:p>
@@ -5509,7 +5509,7 @@
           <w:color w:val="0F766E"/>
           <w:sz w:val="22"/>
         </w:rPr>
-        <w:t>High-Yield Rationale:</w:t>
+        <w:t>Explanation:</w:t>
       </w:r>
     </w:p>
     <w:p>
@@ -5724,7 +5724,7 @@
           <w:color w:val="0F766E"/>
           <w:sz w:val="22"/>
         </w:rPr>
-        <w:t>High-Yield Rationale:</w:t>
+        <w:t>Explanation:</w:t>
       </w:r>
     </w:p>
     <w:p>
@@ -5939,7 +5939,7 @@
           <w:color w:val="0F766E"/>
           <w:sz w:val="22"/>
         </w:rPr>
-        <w:t>High-Yield Rationale:</w:t>
+        <w:t>Explanation:</w:t>
       </w:r>
     </w:p>
     <w:p>
@@ -6154,7 +6154,7 @@
           <w:color w:val="0F766E"/>
           <w:sz w:val="22"/>
         </w:rPr>
-        <w:t>High-Yield Rationale:</w:t>
+        <w:t>Explanation:</w:t>
       </w:r>
     </w:p>
     <w:p>
@@ -6369,7 +6369,7 @@
           <w:color w:val="0F766E"/>
           <w:sz w:val="22"/>
         </w:rPr>
-        <w:t>High-Yield Rationale:</w:t>
+        <w:t>Explanation:</w:t>
       </w:r>
     </w:p>
     <w:p>
@@ -6584,7 +6584,7 @@
           <w:color w:val="0F766E"/>
           <w:sz w:val="22"/>
         </w:rPr>
-        <w:t>High-Yield Rationale:</w:t>
+        <w:t>Explanation:</w:t>
       </w:r>
     </w:p>
     <w:p>
@@ -6799,7 +6799,7 @@
           <w:color w:val="0F766E"/>
           <w:sz w:val="22"/>
         </w:rPr>
-        <w:t>High-Yield Rationale:</w:t>
+        <w:t>Explanation:</w:t>
       </w:r>
     </w:p>
     <w:p>
@@ -7014,7 +7014,7 @@
           <w:color w:val="0F766E"/>
           <w:sz w:val="22"/>
         </w:rPr>
-        <w:t>High-Yield Rationale:</w:t>
+        <w:t>Explanation:</w:t>
       </w:r>
     </w:p>
     <w:p>
@@ -7229,7 +7229,7 @@
           <w:color w:val="0F766E"/>
           <w:sz w:val="22"/>
         </w:rPr>
-        <w:t>High-Yield Rationale:</w:t>
+        <w:t>Explanation:</w:t>
       </w:r>
     </w:p>
     <w:p>
@@ -7444,7 +7444,7 @@
           <w:color w:val="0F766E"/>
           <w:sz w:val="22"/>
         </w:rPr>
-        <w:t>High-Yield Rationale:</w:t>
+        <w:t>Explanation:</w:t>
       </w:r>
     </w:p>
     <w:p>
@@ -7659,7 +7659,7 @@
           <w:color w:val="0F766E"/>
           <w:sz w:val="22"/>
         </w:rPr>
-        <w:t>High-Yield Rationale:</w:t>
+        <w:t>Explanation:</w:t>
       </w:r>
     </w:p>
     <w:p>
@@ -7874,7 +7874,7 @@
           <w:color w:val="0F766E"/>
           <w:sz w:val="22"/>
         </w:rPr>
-        <w:t>High-Yield Rationale:</w:t>
+        <w:t>Explanation:</w:t>
       </w:r>
     </w:p>
     <w:p>
@@ -8089,7 +8089,7 @@
           <w:color w:val="0F766E"/>
           <w:sz w:val="22"/>
         </w:rPr>
-        <w:t>High-Yield Rationale:</w:t>
+        <w:t>Explanation:</w:t>
       </w:r>
     </w:p>
     <w:p>
@@ -8304,7 +8304,7 @@
           <w:color w:val="0F766E"/>
           <w:sz w:val="22"/>
         </w:rPr>
-        <w:t>High-Yield Rationale:</w:t>
+        <w:t>Explanation:</w:t>
       </w:r>
     </w:p>
     <w:p>
@@ -8519,7 +8519,7 @@
           <w:color w:val="0F766E"/>
           <w:sz w:val="22"/>
         </w:rPr>
-        <w:t>High-Yield Rationale:</w:t>
+        <w:t>Explanation:</w:t>
       </w:r>
     </w:p>
     <w:p>
@@ -8734,7 +8734,7 @@
           <w:color w:val="0F766E"/>
           <w:sz w:val="22"/>
         </w:rPr>
-        <w:t>High-Yield Rationale:</w:t>
+        <w:t>Explanation:</w:t>
       </w:r>
     </w:p>
     <w:p>
@@ -8949,7 +8949,7 @@
           <w:color w:val="0F766E"/>
           <w:sz w:val="22"/>
         </w:rPr>
-        <w:t>High-Yield Rationale:</w:t>
+        <w:t>Explanation:</w:t>
       </w:r>
     </w:p>
     <w:p>
@@ -9164,7 +9164,7 @@
           <w:color w:val="0F766E"/>
           <w:sz w:val="22"/>
         </w:rPr>
-        <w:t>High-Yield Rationale:</w:t>
+        <w:t>Explanation:</w:t>
       </w:r>
     </w:p>
     <w:p>
@@ -9379,7 +9379,7 @@
           <w:color w:val="0F766E"/>
           <w:sz w:val="22"/>
         </w:rPr>
-        <w:t>High-Yield Rationale:</w:t>
+        <w:t>Explanation:</w:t>
       </w:r>
     </w:p>
     <w:p>
@@ -9594,7 +9594,7 @@
           <w:color w:val="0F766E"/>
           <w:sz w:val="22"/>
         </w:rPr>
-        <w:t>High-Yield Rationale:</w:t>
+        <w:t>Explanation:</w:t>
       </w:r>
     </w:p>
     <w:p>
@@ -9809,7 +9809,7 @@
           <w:color w:val="0F766E"/>
           <w:sz w:val="22"/>
         </w:rPr>
-        <w:t>High-Yield Rationale:</w:t>
+        <w:t>Explanation:</w:t>
       </w:r>
     </w:p>
     <w:p>
@@ -10024,7 +10024,7 @@
           <w:color w:val="0F766E"/>
           <w:sz w:val="22"/>
         </w:rPr>
-        <w:t>High-Yield Rationale:</w:t>
+        <w:t>Explanation:</w:t>
       </w:r>
     </w:p>
     <w:p>
@@ -10239,7 +10239,7 @@
           <w:color w:val="0F766E"/>
           <w:sz w:val="22"/>
         </w:rPr>
-        <w:t>High-Yield Rationale:</w:t>
+        <w:t>Explanation:</w:t>
       </w:r>
     </w:p>
     <w:p>
@@ -10454,7 +10454,7 @@
           <w:color w:val="0F766E"/>
           <w:sz w:val="22"/>
         </w:rPr>
-        <w:t>High-Yield Rationale:</w:t>
+        <w:t>Explanation:</w:t>
       </w:r>
     </w:p>
     <w:p>
@@ -10669,7 +10669,7 @@
           <w:color w:val="0F766E"/>
           <w:sz w:val="22"/>
         </w:rPr>
-        <w:t>High-Yield Rationale:</w:t>
+        <w:t>Explanation:</w:t>
       </w:r>
     </w:p>
     <w:p>
@@ -10884,7 +10884,7 @@
           <w:color w:val="0F766E"/>
           <w:sz w:val="22"/>
         </w:rPr>
-        <w:t>High-Yield Rationale:</w:t>
+        <w:t>Explanation:</w:t>
       </w:r>
     </w:p>
     <w:p>

</xml_diff>